<commit_message>
Update 1.1.2 and 1.2.2 template
</commit_message>
<xml_diff>
--- a/Templates/1.1.2-1.2.2.docx
+++ b/Templates/1.1.2-1.2.2.docx
@@ -27,12 +27,12 @@
           <wp:anchor distT="0" distB="0" distL="114300" distR="114300" simplePos="0" relativeHeight="251658240" behindDoc="0" locked="0" layoutInCell="1" allowOverlap="1">
             <wp:simplePos x="0" y="0"/>
             <wp:positionH relativeFrom="column">
-              <wp:posOffset>-563570</wp:posOffset>
+              <wp:posOffset>-463990</wp:posOffset>
             </wp:positionH>
             <wp:positionV relativeFrom="paragraph">
-              <wp:posOffset>-3175</wp:posOffset>
+              <wp:posOffset>-3810</wp:posOffset>
             </wp:positionV>
-            <wp:extent cx="862906" cy="1002030"/>
+            <wp:extent cx="666935" cy="1002030"/>
             <wp:effectExtent l="0" t="0" r="0" b="7620"/>
             <wp:wrapNone/>
             <wp:docPr id="1" name="Picture 1"/>
@@ -46,21 +46,22 @@
                     <pic:cNvPr id="1" name="images (4).jpg"/>
                     <pic:cNvPicPr/>
                   </pic:nvPicPr>
-                  <pic:blipFill rotWithShape="1">
-                    <a:blip r:embed="rId4">
+                  <pic:blipFill>
+                    <a:blip r:embed="rId4" cstate="print">
                       <a:extLst>
                         <a:ext uri="{28A0092B-C50C-407E-A947-70E740481C1C}">
                           <a14:useLocalDpi xmlns:a14="http://schemas.microsoft.com/office/drawing/2010/main" val="0"/>
                         </a:ext>
                       </a:extLst>
                     </a:blip>
-                    <a:srcRect l="-663" t="2719" r="17148" b="301"/>
-                    <a:stretch/>
+                    <a:stretch>
+                      <a:fillRect/>
+                    </a:stretch>
                   </pic:blipFill>
                   <pic:spPr bwMode="auto">
                     <a:xfrm>
                       <a:off x="0" y="0"/>
-                      <a:ext cx="862906" cy="1002030"/>
+                      <a:ext cx="666935" cy="1002030"/>
                     </a:xfrm>
                     <a:prstGeom prst="rect">
                       <a:avLst/>
@@ -264,6 +265,8 @@
         </w:rPr>
         <w:t>Department of _________________</w:t>
       </w:r>
+      <w:bookmarkStart w:id="0" w:name="_GoBack"/>
+      <w:bookmarkEnd w:id="0"/>
     </w:p>
     <w:p>
       <w:pPr>
@@ -3318,8 +3321,6 @@
         </w:rPr>
         <w:t xml:space="preserve"> During the year , Total percentage of content </w:t>
       </w:r>
-      <w:bookmarkStart w:id="0" w:name="_GoBack"/>
-      <w:bookmarkEnd w:id="0"/>
     </w:p>
     <w:p>
       <w:pPr>

</xml_diff>